<commit_message>
UPD11: widen page to 14x11 landscape with 0.5in margins so wide images are not auto-shrunk by Word
</commit_message>
<xml_diff>
--- a/lnd/reference.docx
+++ b/lnd/reference.docx
@@ -1,6 +1,6 @@
 
 <file path=word/document.xml><?xml version="1.0" encoding="utf-8"?>
-<w:document xmlns:w="http://schemas.openxmlformats.org/wordprocessingml/2006/main" xmlns:m="http://schemas.openxmlformats.org/officeDocument/2006/math" xmlns:r="http://schemas.openxmlformats.org/officeDocument/2006/relationships" xmlns:o="urn:schemas-microsoft-com:office:office" xmlns:v="urn:schemas-microsoft-com:vml" xmlns:w10="urn:schemas-microsoft-com:office:word" xmlns:a="http://schemas.openxmlformats.org/drawingml/2006/main" xmlns:pic="http://schemas.openxmlformats.org/drawingml/2006/picture" xmlns:wp="http://schemas.openxmlformats.org/drawingml/2006/wordprocessingDrawing">
+<w:document xmlns:ns1="http://schemas.openxmlformats.org/officeDocument/2006/relationships" xmlns:w="http://schemas.openxmlformats.org/wordprocessingml/2006/main">
   <w:body>
     <w:p>
       <w:pPr>
@@ -162,7 +162,7 @@
       <w:r>
         <w:t xml:space="preserve"> </w:t>
       </w:r>
-      <w:hyperlink r:id="rId30">
+      <w:hyperlink ns1:id="rId30">
         <w:r>
           <w:rPr>
             <w:rStyle w:val="Hyperlink"/>
@@ -317,6 +317,8 @@
       <w:footnotePr>
         <w:numRestart w:val="eachSect"/>
       </w:footnotePr>
+      <w:pgSz w:w="20160" w:h="15840" w:orient="landscape"/>
+      <w:pgMar w:top="720" w:right="720" w:bottom="720" w:left="720" w:header="720" w:footer="720" w:gutter="0"/>
     </w:sectPr>
   </w:body>
 </w:document>

</xml_diff>